<commit_message>
adjusted landing page dashboard card size
</commit_message>
<xml_diff>
--- a/docs/Display_Themes_Admin_Guide.docx
+++ b/docs/Display_Themes_Admin_Guide.docx
@@ -860,7 +860,7 @@
         <w:spacing w:after="140" w:line="276"/>
       </w:pPr>
       <w:r>
-        <w:t xml:space="preserve">There are two ways to start, and both let you build on an existing look. The quickest is to </w:t>
+        <w:t xml:space="preserve">There are three ways to start, and all let you build on something. The quickest is to </w:t>
       </w:r>
       <w:r>
         <w:rPr>
@@ -870,7 +870,7 @@
         <w:t xml:space="preserve">Duplicate</w:t>
       </w:r>
       <w:r>
-        <w:t xml:space="preserve"> any theme — including the System Default — which opens a pre-filled copy you can rename and tweak. Or start from scratch with </w:t>
+        <w:t xml:space="preserve"> any theme — including the System Default — which opens a pre-filled copy you can rename and tweak. You can also start a </w:t>
       </w:r>
       <w:r>
         <w:rPr>
@@ -880,7 +880,7 @@
         <w:t xml:space="preserve">New Theme</w:t>
       </w:r>
       <w:r>
-        <w:t xml:space="preserve"> and choose a base from the </w:t>
+        <w:t xml:space="preserve"> and pick a base from the </w:t>
       </w:r>
       <w:r>
         <w:rPr>
@@ -890,7 +890,17 @@
         <w:t xml:space="preserve">Start from</w:t>
       </w:r>
       <w:r>
-        <w:t xml:space="preserve"> menu.</w:t>
+        <w:t xml:space="preserve"> menu, or generate a starting palette and background from an </w:t>
+      </w:r>
+      <w:r>
+        <w:rPr>
+          <w:b/>
+          <w:bCs/>
+        </w:rPr>
+        <w:t xml:space="preserve">image or PDF</w:t>
+      </w:r>
+      <w:r>
+        <w:t xml:space="preserve">.</w:t>
       </w:r>
     </w:p>
     <w:p>
@@ -1110,10 +1120,28 @@
     </w:p>
     <w:p>
       <w:pPr>
-        <w:pStyle w:val="Heading1"/>
-      </w:pPr>
-      <w:r>
-        <w:t xml:space="preserve">6. Editing an existing theme</w:t>
+        <w:pStyle w:val="Heading2"/>
+      </w:pPr>
+      <w:r>
+        <w:t xml:space="preserve">Create from an image or PDF</w:t>
+      </w:r>
+    </w:p>
+    <w:p>
+      <w:pPr>
+        <w:spacing w:after="140" w:line="276"/>
+      </w:pPr>
+      <w:r>
+        <w:t xml:space="preserve">Upload a picture or PDF (for example, a flyer or a brand sheet) and the editor derives a color palette and a blurred background from it as a starting point. Note that the on-screen </w:t>
+      </w:r>
+      <w:r>
+        <w:rPr>
+          <w:b/>
+          <w:bCs/>
+        </w:rPr>
+        <w:t xml:space="preserve">preview shows a solid fallback color</w:t>
+      </w:r>
+      <w:r>
+        <w:t xml:space="preserve"> for the background; the actual blurred image appears on the iPad and Android displays.</w:t>
       </w:r>
     </w:p>
     <w:p>
@@ -1126,17 +1154,17 @@
         <w:spacing w:after="100" w:line="276"/>
       </w:pPr>
       <w:r>
-        <w:t xml:space="preserve">Open </w:t>
+        <w:t xml:space="preserve">Click </w:t>
       </w:r>
       <w:r>
         <w:rPr>
           <w:b/>
           <w:bCs/>
         </w:rPr>
-        <w:t xml:space="preserve">Settings ▸ Display Themes</w:t>
-      </w:r>
-      <w:r>
-        <w:t xml:space="preserve"> and locate the theme in the list.</w:t>
+        <w:t xml:space="preserve">New Theme</w:t>
+      </w:r>
+      <w:r>
+        <w:t xml:space="preserve">.</w:t>
       </w:r>
     </w:p>
     <w:p>
@@ -1149,17 +1177,17 @@
         <w:spacing w:after="100" w:line="276"/>
       </w:pPr>
       <w:r>
-        <w:t xml:space="preserve">Click </w:t>
+        <w:t xml:space="preserve">Under </w:t>
       </w:r>
       <w:r>
         <w:rPr>
           <w:b/>
           <w:bCs/>
         </w:rPr>
-        <w:t xml:space="preserve">Edit</w:t>
-      </w:r>
-      <w:r>
-        <w:t xml:space="preserve"> to open it in the Theme Editor.</w:t>
+        <w:t xml:space="preserve">Create from image or PDF</w:t>
+      </w:r>
+      <w:r>
+        <w:t xml:space="preserve">, choose a PNG, JPEG, or PDF file. The editor fills in the palette, background, name, and key for you.</w:t>
       </w:r>
     </w:p>
     <w:p>
@@ -1172,30 +1200,17 @@
         <w:spacing w:after="100" w:line="276"/>
       </w:pPr>
       <w:r>
-        <w:t xml:space="preserve">Change the tokens you want; watch the live preview to confirm the look.</w:t>
-      </w:r>
-    </w:p>
-    <w:p>
-      <w:pPr>
-        <w:pStyle w:val="ListParagraph"/>
-        <w:numPr>
-          <w:ilvl w:val="0"/>
-          <w:numId w:val="5"/>
-        </w:numPr>
-        <w:spacing w:after="100" w:line="276"/>
-      </w:pPr>
-      <w:r>
-        <w:t xml:space="preserve">Click </w:t>
+        <w:t xml:space="preserve">Review the colors in the live preview, adjust anything you like, then click </w:t>
       </w:r>
       <w:r>
         <w:rPr>
           <w:b/>
           <w:bCs/>
         </w:rPr>
-        <w:t xml:space="preserve">Save</w:t>
-      </w:r>
-      <w:r>
-        <w:t xml:space="preserve">. Screens using this theme update on their next refresh.</w:t>
+        <w:t xml:space="preserve">Create theme</w:t>
+      </w:r>
+      <w:r>
+        <w:t xml:space="preserve">.</w:t>
       </w:r>
     </w:p>
     <w:p>
@@ -1207,20 +1222,10 @@
           <w:b/>
           <w:bCs/>
         </w:rPr>
-        <w:t xml:space="preserve">Note: </w:t>
-      </w:r>
-      <w:r>
-        <w:t xml:space="preserve">editing a theme affects every room currently using it. If you only want to change one room, create a copy and assign that copy to the room instead (section 7). The only theme you cannot edit or archive is the </w:t>
-      </w:r>
-      <w:r>
-        <w:rPr>
-          <w:b/>
-          <w:bCs/>
-        </w:rPr>
-        <w:t xml:space="preserve">System Default</w:t>
-      </w:r>
-      <w:r>
-        <w:t xml:space="preserve">; to base a new look on it, start a new theme from it (section 5) rather than changing it in place.</w:t>
+        <w:t xml:space="preserve">For best results: </w:t>
+      </w:r>
+      <w:r>
+        <w:t xml:space="preserve">use a landscape image about 1280–1920 pixels on the long edge — the file is downscaled to roughly that size, so anything larger adds nothing — with a few strong, dominant colors. The displays are landscape, so landscape images fill the background most cleanly. Mostly-white documents (typical text PDFs and flyers) produce a pale, low-contrast palette you’ll want to darken, and only the first page of a PDF is used.</w:t>
       </w:r>
     </w:p>
     <w:p>
@@ -1228,23 +1233,7 @@
         <w:pStyle w:val="Heading1"/>
       </w:pPr>
       <w:r>
-        <w:t xml:space="preserve">7. Applying a theme to rooms</w:t>
-      </w:r>
-    </w:p>
-    <w:p>
-      <w:pPr>
-        <w:spacing w:after="140" w:line="276"/>
-      </w:pPr>
-      <w:r>
-        <w:t xml:space="preserve">A saved theme does nothing until it is assigned. You have two options:</w:t>
-      </w:r>
-    </w:p>
-    <w:p>
-      <w:pPr>
-        <w:pStyle w:val="Heading2"/>
-      </w:pPr>
-      <w:r>
-        <w:t xml:space="preserve">Assign to a specific room</w:t>
+        <w:t xml:space="preserve">6. Editing an existing theme</w:t>
       </w:r>
     </w:p>
     <w:p>
@@ -1257,7 +1246,7 @@
         <w:spacing w:after="100" w:line="276"/>
       </w:pPr>
       <w:r>
-        <w:t xml:space="preserve">Open the rooms list (under </w:t>
+        <w:t xml:space="preserve">Open </w:t>
       </w:r>
       <w:r>
         <w:rPr>
@@ -1267,7 +1256,7 @@
         <w:t xml:space="preserve">Settings ▸ Display Themes</w:t>
       </w:r>
       <w:r>
-        <w:t xml:space="preserve"> or your room management page).</w:t>
+        <w:t xml:space="preserve"> and locate the theme in the list.</w:t>
       </w:r>
     </w:p>
     <w:p>
@@ -1280,7 +1269,17 @@
         <w:spacing w:after="100" w:line="276"/>
       </w:pPr>
       <w:r>
-        <w:t xml:space="preserve">Choose the theme for the room you want to override.</w:t>
+        <w:t xml:space="preserve">Click </w:t>
+      </w:r>
+      <w:r>
+        <w:rPr>
+          <w:b/>
+          <w:bCs/>
+        </w:rPr>
+        <w:t xml:space="preserve">Edit</w:t>
+      </w:r>
+      <w:r>
+        <w:t xml:space="preserve"> to open it in the Theme Editor.</w:t>
       </w:r>
     </w:p>
     <w:p>
@@ -1293,7 +1292,71 @@
         <w:spacing w:after="100" w:line="276"/>
       </w:pPr>
       <w:r>
-        <w:t xml:space="preserve">Save. That room now uses this theme regardless of the organization default.</w:t>
+        <w:t xml:space="preserve">Change the tokens you want; watch the live preview to confirm the look.</w:t>
+      </w:r>
+    </w:p>
+    <w:p>
+      <w:pPr>
+        <w:pStyle w:val="ListParagraph"/>
+        <w:numPr>
+          <w:ilvl w:val="0"/>
+          <w:numId w:val="6"/>
+        </w:numPr>
+        <w:spacing w:after="100" w:line="276"/>
+      </w:pPr>
+      <w:r>
+        <w:t xml:space="preserve">Click </w:t>
+      </w:r>
+      <w:r>
+        <w:rPr>
+          <w:b/>
+          <w:bCs/>
+        </w:rPr>
+        <w:t xml:space="preserve">Save</w:t>
+      </w:r>
+      <w:r>
+        <w:t xml:space="preserve">. Screens using this theme update on their next refresh.</w:t>
+      </w:r>
+    </w:p>
+    <w:p>
+      <w:pPr>
+        <w:spacing w:after="140" w:line="276"/>
+      </w:pPr>
+      <w:r>
+        <w:rPr>
+          <w:b/>
+          <w:bCs/>
+        </w:rPr>
+        <w:t xml:space="preserve">Note: </w:t>
+      </w:r>
+      <w:r>
+        <w:t xml:space="preserve">editing a theme affects every room currently using it. If you only want to change one room, create a copy and assign that copy to the room instead (section 7). The only theme you cannot edit or archive is the </w:t>
+      </w:r>
+      <w:r>
+        <w:rPr>
+          <w:b/>
+          <w:bCs/>
+        </w:rPr>
+        <w:t xml:space="preserve">System Default</w:t>
+      </w:r>
+      <w:r>
+        <w:t xml:space="preserve">; to base a new look on it, start a new theme from it (section 5) rather than changing it in place.</w:t>
+      </w:r>
+    </w:p>
+    <w:p>
+      <w:pPr>
+        <w:pStyle w:val="Heading1"/>
+      </w:pPr>
+      <w:r>
+        <w:t xml:space="preserve">7. Applying a theme to rooms</w:t>
+      </w:r>
+    </w:p>
+    <w:p>
+      <w:pPr>
+        <w:spacing w:after="140" w:line="276"/>
+      </w:pPr>
+      <w:r>
+        <w:t xml:space="preserve">A saved theme does nothing until it is assigned. You have two options:</w:t>
       </w:r>
     </w:p>
     <w:p>
@@ -1301,7 +1364,7 @@
         <w:pStyle w:val="Heading2"/>
       </w:pPr>
       <w:r>
-        <w:t xml:space="preserve">Set the organization default</w:t>
+        <w:t xml:space="preserve">Assign to a specific room</w:t>
       </w:r>
     </w:p>
     <w:p>
@@ -1314,7 +1377,17 @@
         <w:spacing w:after="100" w:line="276"/>
       </w:pPr>
       <w:r>
-        <w:t xml:space="preserve">Select the theme you want as the default for all rooms that don’t have their own override.</w:t>
+        <w:t xml:space="preserve">Open the rooms list (under </w:t>
+      </w:r>
+      <w:r>
+        <w:rPr>
+          <w:b/>
+          <w:bCs/>
+        </w:rPr>
+        <w:t xml:space="preserve">Settings ▸ Display Themes</w:t>
+      </w:r>
+      <w:r>
+        <w:t xml:space="preserve"> or your room management page).</w:t>
       </w:r>
     </w:p>
     <w:p>
@@ -1323,6 +1396,53 @@
         <w:numPr>
           <w:ilvl w:val="0"/>
           <w:numId w:val="7"/>
+        </w:numPr>
+        <w:spacing w:after="100" w:line="276"/>
+      </w:pPr>
+      <w:r>
+        <w:t xml:space="preserve">Choose the theme for the room you want to override.</w:t>
+      </w:r>
+    </w:p>
+    <w:p>
+      <w:pPr>
+        <w:pStyle w:val="ListParagraph"/>
+        <w:numPr>
+          <w:ilvl w:val="0"/>
+          <w:numId w:val="7"/>
+        </w:numPr>
+        <w:spacing w:after="100" w:line="276"/>
+      </w:pPr>
+      <w:r>
+        <w:t xml:space="preserve">Save. That room now uses this theme regardless of the organization default.</w:t>
+      </w:r>
+    </w:p>
+    <w:p>
+      <w:pPr>
+        <w:pStyle w:val="Heading2"/>
+      </w:pPr>
+      <w:r>
+        <w:t xml:space="preserve">Set the organization default</w:t>
+      </w:r>
+    </w:p>
+    <w:p>
+      <w:pPr>
+        <w:pStyle w:val="ListParagraph"/>
+        <w:numPr>
+          <w:ilvl w:val="0"/>
+          <w:numId w:val="8"/>
+        </w:numPr>
+        <w:spacing w:after="100" w:line="276"/>
+      </w:pPr>
+      <w:r>
+        <w:t xml:space="preserve">Select the theme you want as the default for all rooms that don’t have their own override.</w:t>
+      </w:r>
+    </w:p>
+    <w:p>
+      <w:pPr>
+        <w:pStyle w:val="ListParagraph"/>
+        <w:numPr>
+          <w:ilvl w:val="0"/>
+          <w:numId w:val="8"/>
         </w:numPr>
         <w:spacing w:after="100" w:line="276"/>
       </w:pPr>
@@ -4649,7 +4769,7 @@
         <w:pStyle w:val="ListParagraph"/>
         <w:numPr>
           <w:ilvl w:val="0"/>
-          <w:numId w:val="8"/>
+          <w:numId w:val="9"/>
         </w:numPr>
         <w:spacing w:after="80" w:line="276"/>
       </w:pPr>
@@ -4669,7 +4789,7 @@
         <w:pStyle w:val="ListParagraph"/>
         <w:numPr>
           <w:ilvl w:val="0"/>
-          <w:numId w:val="8"/>
+          <w:numId w:val="9"/>
         </w:numPr>
         <w:spacing w:after="80" w:line="276"/>
       </w:pPr>
@@ -4689,7 +4809,7 @@
         <w:pStyle w:val="ListParagraph"/>
         <w:numPr>
           <w:ilvl w:val="0"/>
-          <w:numId w:val="8"/>
+          <w:numId w:val="9"/>
         </w:numPr>
         <w:spacing w:after="80" w:line="276"/>
       </w:pPr>
@@ -4709,7 +4829,7 @@
         <w:pStyle w:val="ListParagraph"/>
         <w:numPr>
           <w:ilvl w:val="0"/>
-          <w:numId w:val="8"/>
+          <w:numId w:val="9"/>
         </w:numPr>
         <w:spacing w:after="80" w:line="276"/>
       </w:pPr>
@@ -4729,7 +4849,7 @@
         <w:pStyle w:val="ListParagraph"/>
         <w:numPr>
           <w:ilvl w:val="0"/>
-          <w:numId w:val="8"/>
+          <w:numId w:val="9"/>
         </w:numPr>
         <w:spacing w:after="80" w:line="276"/>
       </w:pPr>
@@ -4749,7 +4869,7 @@
         <w:pStyle w:val="ListParagraph"/>
         <w:numPr>
           <w:ilvl w:val="0"/>
-          <w:numId w:val="8"/>
+          <w:numId w:val="9"/>
         </w:numPr>
         <w:spacing w:after="80" w:line="276"/>
       </w:pPr>
@@ -5092,6 +5212,18 @@
       </w:pPr>
     </w:lvl>
   </w:abstractNum>
+  <w:abstractNum w:abstractNumId="9" w15:restartNumberingAfterBreak="0">
+    <w:multiLevelType w:val="hybridMultilevel"/>
+    <w:lvl w:ilvl="0" w15:tentative="1">
+      <w:start w:val="1"/>
+      <w:numFmt w:val="decimal"/>
+      <w:lvlText w:val="%1."/>
+      <w:lvlJc w:val="left"/>
+      <w:pPr>
+        <w:ind w:left="540" w:hanging="320"/>
+      </w:pPr>
+    </w:lvl>
+  </w:abstractNum>
   <w:num w:numId="1">
     <w:abstractNumId w:val="1"/>
     <w:lvlOverride w:ilvl="0">
@@ -5135,6 +5267,12 @@
     </w:lvlOverride>
   </w:num>
   <w:num w:numId="8">
+    <w:abstractNumId w:val="9"/>
+    <w:lvlOverride w:ilvl="0">
+      <w:startOverride w:val="1"/>
+    </w:lvlOverride>
+  </w:num>
+  <w:num w:numId="9">
     <w:abstractNumId w:val="2"/>
     <w:lvlOverride w:ilvl="0">
       <w:startOverride w:val="1"/>

</xml_diff>